<commit_message>
Add theme and web settings XML files for Word document templates
- Created a new theme XML file (theme1.xml) defining the Office theme elements, color schemes, font schemes, and formatting styles.
- Added a web settings XML file (webSettings.xml) to specify compatibility and relationship namespaces for Word processing documents.

Co-authored-by: Copilot <copilot@github.com>
</commit_message>
<xml_diff>
--- a/base/templates/ACTA PRES.PUB-BORRADOR.docx
+++ b/base/templates/ACTA PRES.PUB-BORRADOR.docx
@@ -240,8 +240,9 @@
                 <w:lang w:val="en-US" w:eastAsia="ar-SA"/>
                 <w14:ligatures w14:val="none"/>
               </w:rPr>
-              <w:t xml:space="preserve">Magister </w:t>
+              <w:t>{{</w:t>
             </w:r>
+            <w:proofErr w:type="spellStart"/>
             <w:r>
               <w:rPr>
                 <w:rFonts w:ascii="Goudy Old Style" w:eastAsia="Times New Roman" w:hAnsi="Goudy Old Style" w:cs="Times New Roman"/>
@@ -251,7 +252,19 @@
                 <w:lang w:val="en-US" w:eastAsia="ar-SA"/>
                 <w14:ligatures w14:val="none"/>
               </w:rPr>
-              <w:t xml:space="preserve">Gabriela Garita González </w:t>
+              <w:t>presidente_nombre</w:t>
+            </w:r>
+            <w:proofErr w:type="spellEnd"/>
+            <w:r>
+              <w:rPr>
+                <w:rFonts w:ascii="Goudy Old Style" w:eastAsia="Times New Roman" w:hAnsi="Goudy Old Style" w:cs="Times New Roman"/>
+                <w:bCs/>
+                <w:color w:val="auto"/>
+                <w:kern w:val="0"/>
+                <w:lang w:val="en-US" w:eastAsia="ar-SA"/>
+                <w14:ligatures w14:val="none"/>
+              </w:rPr>
+              <w:t>}}</w:t>
             </w:r>
           </w:p>
         </w:tc>
@@ -285,7 +298,35 @@
                 <w:lang w:eastAsia="ar-SA"/>
                 <w14:ligatures w14:val="none"/>
               </w:rPr>
-              <w:t>{{presidente_cargo}}. Quien preside.</w:t>
+              <w:t>{{</w:t>
+            </w:r>
+            <w:proofErr w:type="spellStart"/>
+            <w:r>
+              <w:rPr>
+                <w:rFonts w:ascii="Goudy Old Style" w:eastAsia="Times New Roman" w:hAnsi="Goudy Old Style" w:cs="Times New Roman"/>
+                <w:bCs/>
+                <w:color w:val="auto"/>
+                <w:kern w:val="0"/>
+                <w:sz w:val="22"/>
+                <w:szCs w:val="22"/>
+                <w:lang w:eastAsia="ar-SA"/>
+                <w14:ligatures w14:val="none"/>
+              </w:rPr>
+              <w:t>presidente_cargo</w:t>
+            </w:r>
+            <w:proofErr w:type="spellEnd"/>
+            <w:r>
+              <w:rPr>
+                <w:rFonts w:ascii="Goudy Old Style" w:eastAsia="Times New Roman" w:hAnsi="Goudy Old Style" w:cs="Times New Roman"/>
+                <w:bCs/>
+                <w:color w:val="auto"/>
+                <w:kern w:val="0"/>
+                <w:sz w:val="22"/>
+                <w:szCs w:val="22"/>
+                <w:lang w:eastAsia="ar-SA"/>
+                <w14:ligatures w14:val="none"/>
+              </w:rPr>
+              <w:t>}}. Quien preside.</w:t>
             </w:r>
           </w:p>
         </w:tc>
@@ -316,7 +357,23 @@
                 <w:rFonts w:ascii="Goudy Old Style" w:eastAsia="MS Mincho" w:hAnsi="Goudy Old Style" w:cs="Arial"/>
                 <w:lang w:val="en-US" w:eastAsia="es-ES"/>
               </w:rPr>
-              <w:t>{{director_nombre}}</w:t>
+              <w:t>{{</w:t>
+            </w:r>
+            <w:proofErr w:type="spellStart"/>
+            <w:r>
+              <w:rPr>
+                <w:rFonts w:ascii="Goudy Old Style" w:eastAsia="MS Mincho" w:hAnsi="Goudy Old Style" w:cs="Arial"/>
+                <w:lang w:val="en-US" w:eastAsia="es-ES"/>
+              </w:rPr>
+              <w:t>director_nombre</w:t>
+            </w:r>
+            <w:proofErr w:type="spellEnd"/>
+            <w:r>
+              <w:rPr>
+                <w:rFonts w:ascii="Goudy Old Style" w:eastAsia="MS Mincho" w:hAnsi="Goudy Old Style" w:cs="Arial"/>
+                <w:lang w:val="en-US" w:eastAsia="es-ES"/>
+              </w:rPr>
+              <w:t>}}</w:t>
             </w:r>
             <w:bookmarkEnd w:id="1"/>
           </w:p>
@@ -352,7 +409,33 @@
                 <w:lang w:eastAsia="ar-SA"/>
                 <w14:ligatures w14:val="none"/>
               </w:rPr>
-              <w:t>{{director_cargo}}</w:t>
+              <w:t>{{</w:t>
+            </w:r>
+            <w:proofErr w:type="spellStart"/>
+            <w:r>
+              <w:rPr>
+                <w:rFonts w:ascii="Goudy Old Style" w:eastAsia="Times New Roman" w:hAnsi="Goudy Old Style" w:cs="Times New Roman"/>
+                <w:color w:val="auto"/>
+                <w:kern w:val="0"/>
+                <w:sz w:val="22"/>
+                <w:szCs w:val="22"/>
+                <w:lang w:eastAsia="ar-SA"/>
+                <w14:ligatures w14:val="none"/>
+              </w:rPr>
+              <w:t>director_cargo</w:t>
+            </w:r>
+            <w:proofErr w:type="spellEnd"/>
+            <w:r>
+              <w:rPr>
+                <w:rFonts w:ascii="Goudy Old Style" w:eastAsia="Times New Roman" w:hAnsi="Goudy Old Style" w:cs="Times New Roman"/>
+                <w:color w:val="auto"/>
+                <w:kern w:val="0"/>
+                <w:sz w:val="22"/>
+                <w:szCs w:val="22"/>
+                <w:lang w:eastAsia="ar-SA"/>
+                <w14:ligatures w14:val="none"/>
+              </w:rPr>
+              <w:t>}}</w:t>
             </w:r>
           </w:p>
         </w:tc>
@@ -389,7 +472,31 @@
                 <w:lang w:eastAsia="ar-SA"/>
                 <w14:ligatures w14:val="none"/>
               </w:rPr>
-              <w:t>{{tutor_nombre}}</w:t>
+              <w:t>{{</w:t>
+            </w:r>
+            <w:proofErr w:type="spellStart"/>
+            <w:r>
+              <w:rPr>
+                <w:rFonts w:ascii="Goudy Old Style" w:eastAsia="Times New Roman" w:hAnsi="Goudy Old Style" w:cs="Times New Roman"/>
+                <w:bCs/>
+                <w:color w:val="auto"/>
+                <w:kern w:val="0"/>
+                <w:lang w:eastAsia="ar-SA"/>
+                <w14:ligatures w14:val="none"/>
+              </w:rPr>
+              <w:t>tutor_nombre</w:t>
+            </w:r>
+            <w:proofErr w:type="spellEnd"/>
+            <w:r>
+              <w:rPr>
+                <w:rFonts w:ascii="Goudy Old Style" w:eastAsia="Times New Roman" w:hAnsi="Goudy Old Style" w:cs="Times New Roman"/>
+                <w:bCs/>
+                <w:color w:val="auto"/>
+                <w:kern w:val="0"/>
+                <w:lang w:eastAsia="ar-SA"/>
+                <w14:ligatures w14:val="none"/>
+              </w:rPr>
+              <w:t>}}</w:t>
             </w:r>
           </w:p>
         </w:tc>
@@ -419,7 +526,29 @@
                 <w:lang w:val="es-ES" w:eastAsia="ar-SA"/>
                 <w14:ligatures w14:val="none"/>
               </w:rPr>
-              <w:t>{{tutor_cargo}}</w:t>
+              <w:t>{{</w:t>
+            </w:r>
+            <w:proofErr w:type="spellStart"/>
+            <w:r>
+              <w:rPr>
+                <w:rFonts w:ascii="Goudy Old Style" w:eastAsia="Times New Roman" w:hAnsi="Goudy Old Style" w:cs="Times New Roman"/>
+                <w:color w:val="auto"/>
+                <w:kern w:val="0"/>
+                <w:lang w:val="es-ES" w:eastAsia="ar-SA"/>
+                <w14:ligatures w14:val="none"/>
+              </w:rPr>
+              <w:t>tutor_cargo</w:t>
+            </w:r>
+            <w:proofErr w:type="spellEnd"/>
+            <w:r>
+              <w:rPr>
+                <w:rFonts w:ascii="Goudy Old Style" w:eastAsia="Times New Roman" w:hAnsi="Goudy Old Style" w:cs="Times New Roman"/>
+                <w:color w:val="auto"/>
+                <w:kern w:val="0"/>
+                <w:lang w:val="es-ES" w:eastAsia="ar-SA"/>
+                <w14:ligatures w14:val="none"/>
+              </w:rPr>
+              <w:t>}}</w:t>
             </w:r>
           </w:p>
         </w:tc>
@@ -456,7 +585,31 @@
                 <w:lang w:eastAsia="ar-SA"/>
                 <w14:ligatures w14:val="none"/>
               </w:rPr>
-              <w:t>{{asesor_nombre}}</w:t>
+              <w:t>{{</w:t>
+            </w:r>
+            <w:proofErr w:type="spellStart"/>
+            <w:r>
+              <w:rPr>
+                <w:rFonts w:ascii="Goudy Old Style" w:eastAsia="Times New Roman" w:hAnsi="Goudy Old Style" w:cs="Times New Roman"/>
+                <w:bCs/>
+                <w:color w:val="auto"/>
+                <w:kern w:val="0"/>
+                <w:lang w:eastAsia="ar-SA"/>
+                <w14:ligatures w14:val="none"/>
+              </w:rPr>
+              <w:t>asesor_nombre</w:t>
+            </w:r>
+            <w:proofErr w:type="spellEnd"/>
+            <w:r>
+              <w:rPr>
+                <w:rFonts w:ascii="Goudy Old Style" w:eastAsia="Times New Roman" w:hAnsi="Goudy Old Style" w:cs="Times New Roman"/>
+                <w:bCs/>
+                <w:color w:val="auto"/>
+                <w:kern w:val="0"/>
+                <w:lang w:eastAsia="ar-SA"/>
+                <w14:ligatures w14:val="none"/>
+              </w:rPr>
+              <w:t>}}</w:t>
             </w:r>
           </w:p>
         </w:tc>
@@ -487,7 +640,31 @@
                 <w:lang w:eastAsia="ar-SA"/>
                 <w14:ligatures w14:val="none"/>
               </w:rPr>
-              <w:t>{{asesor_cargo}}</w:t>
+              <w:t>{{</w:t>
+            </w:r>
+            <w:proofErr w:type="spellStart"/>
+            <w:r>
+              <w:rPr>
+                <w:rFonts w:ascii="Goudy Old Style" w:eastAsia="Times New Roman" w:hAnsi="Goudy Old Style" w:cs="Times New Roman"/>
+                <w:bCs/>
+                <w:color w:val="auto"/>
+                <w:kern w:val="0"/>
+                <w:lang w:eastAsia="ar-SA"/>
+                <w14:ligatures w14:val="none"/>
+              </w:rPr>
+              <w:t>asesor_cargo</w:t>
+            </w:r>
+            <w:proofErr w:type="spellEnd"/>
+            <w:r>
+              <w:rPr>
+                <w:rFonts w:ascii="Goudy Old Style" w:eastAsia="Times New Roman" w:hAnsi="Goudy Old Style" w:cs="Times New Roman"/>
+                <w:bCs/>
+                <w:color w:val="auto"/>
+                <w:kern w:val="0"/>
+                <w:lang w:eastAsia="ar-SA"/>
+                <w14:ligatures w14:val="none"/>
+              </w:rPr>
+              <w:t>}}</w:t>
             </w:r>
           </w:p>
         </w:tc>
@@ -539,6 +716,15 @@
         </w:tc>
       </w:tr>
     </w:tbl>
+    <w:p>
+      <w:pPr>
+        <w:spacing w:after="0" w:line="259" w:lineRule="auto"/>
+        <w:ind w:left="0" w:right="5" w:firstLine="0"/>
+        <w:rPr>
+          <w:rFonts w:ascii="Goudy Old Style" w:hAnsi="Goudy Old Style"/>
+        </w:rPr>
+      </w:pPr>
+    </w:p>
     <w:p>
       <w:pPr>
         <w:spacing w:after="236" w:line="259" w:lineRule="auto"/>
@@ -1213,63 +1399,6 @@
     </w:p>
     <w:p>
       <w:pPr>
-        <w:spacing w:after="95" w:line="259" w:lineRule="auto"/>
-        <w:ind w:left="4094" w:right="0" w:firstLine="0"/>
-        <w:jc w:val="left"/>
-        <w:rPr>
-          <w:rFonts w:ascii="Goudy Old Style" w:hAnsi="Goudy Old Style"/>
-        </w:rPr>
-      </w:pPr>
-    </w:p>
-    <w:p>
-      <w:pPr>
-        <w:spacing w:after="95" w:line="259" w:lineRule="auto"/>
-        <w:ind w:left="4094" w:right="0" w:firstLine="0"/>
-        <w:jc w:val="left"/>
-        <w:rPr>
-          <w:rFonts w:ascii="Goudy Old Style" w:hAnsi="Goudy Old Style"/>
-        </w:rPr>
-      </w:pPr>
-    </w:p>
-    <w:p>
-      <w:pPr>
-        <w:spacing w:after="95" w:line="259" w:lineRule="auto"/>
-        <w:ind w:left="4094" w:right="0" w:firstLine="0"/>
-        <w:jc w:val="left"/>
-        <w:rPr>
-          <w:rFonts w:ascii="Goudy Old Style" w:hAnsi="Goudy Old Style"/>
-        </w:rPr>
-      </w:pPr>
-    </w:p>
-    <w:p>
-      <w:pPr>
-        <w:spacing w:after="0" w:line="259" w:lineRule="auto"/>
-        <w:ind w:left="0" w:right="5" w:firstLine="0"/>
-        <w:jc w:val="center"/>
-        <w:rPr>
-          <w:rFonts w:ascii="Goudy Old Style" w:hAnsi="Goudy Old Style"/>
-        </w:rPr>
-      </w:pPr>
-    </w:p>
-    <w:p>
-      <w:pPr>
-        <w:spacing w:after="0" w:line="259" w:lineRule="auto"/>
-        <w:ind w:left="0" w:right="5" w:firstLine="0"/>
-        <w:jc w:val="center"/>
-        <w:rPr>
-          <w:rFonts w:ascii="Goudy Old Style" w:hAnsi="Goudy Old Style"/>
-        </w:rPr>
-      </w:pPr>
-      <w:r>
-        <w:rPr>
-          <w:rFonts w:ascii="Goudy Old Style" w:hAnsi="Goudy Old Style"/>
-          <w:bCs/>
-        </w:rPr>
-        <w:t>{{presidente_nombre}}</w:t>
-      </w:r>
-    </w:p>
-    <w:p>
-      <w:pPr>
         <w:spacing w:after="0" w:line="240" w:lineRule="auto"/>
         <w:ind w:left="1568" w:right="1559"/>
         <w:jc w:val="center"/>
@@ -1280,24 +1409,45 @@
       </w:pPr>
       <w:r>
         <w:rPr>
+          <w:rFonts w:ascii="Goudy Old Style" w:eastAsia="Times New Roman" w:hAnsi="Goudy Old Style" w:cs="Times New Roman"/>
+          <w:bCs/>
+          <w:color w:val="auto"/>
+          <w:kern w:val="0"/>
+          <w:lang w:val="en-US" w:eastAsia="ar-SA"/>
+          <w14:ligatures w14:val="none"/>
+        </w:rPr>
+        <w:t>{{</w:t>
+      </w:r>
+      <w:proofErr w:type="spellStart"/>
+      <w:r>
+        <w:rPr>
+          <w:rFonts w:ascii="Goudy Old Style" w:eastAsia="Times New Roman" w:hAnsi="Goudy Old Style" w:cs="Times New Roman"/>
+          <w:bCs/>
+          <w:color w:val="auto"/>
+          <w:kern w:val="0"/>
+          <w:lang w:val="en-US" w:eastAsia="ar-SA"/>
+          <w14:ligatures w14:val="none"/>
+        </w:rPr>
+        <w:t>presidente_nombre</w:t>
+      </w:r>
+      <w:proofErr w:type="spellEnd"/>
+      <w:r>
+        <w:rPr>
+          <w:rFonts w:ascii="Goudy Old Style" w:eastAsia="Times New Roman" w:hAnsi="Goudy Old Style" w:cs="Times New Roman"/>
+          <w:bCs/>
+          <w:color w:val="auto"/>
+          <w:kern w:val="0"/>
+          <w:lang w:val="en-US" w:eastAsia="ar-SA"/>
+          <w14:ligatures w14:val="none"/>
+        </w:rPr>
+        <w:t>}}</w:t>
+      </w:r>
+      <w:r>
+        <w:rPr>
           <w:rFonts w:ascii="Goudy Old Style" w:hAnsi="Goudy Old Style"/>
           <w:b/>
         </w:rPr>
-        <w:t>Representante del Decano</w:t>
-      </w:r>
-      <w:r>
-        <w:rPr>
-          <w:rFonts w:ascii="Goudy Old Style" w:hAnsi="Goudy Old Style"/>
-          <w:b/>
-        </w:rPr>
         <w:t>.</w:t>
-      </w:r>
-      <w:r>
-        <w:rPr>
-          <w:rFonts w:ascii="Goudy Old Style" w:hAnsi="Goudy Old Style"/>
-          <w:b/>
-        </w:rPr>
-        <w:t xml:space="preserve"> </w:t>
       </w:r>
     </w:p>
     <w:p>
@@ -1315,7 +1465,14 @@
           <w:rFonts w:ascii="Goudy Old Style" w:hAnsi="Goudy Old Style"/>
           <w:b/>
         </w:rPr>
-        <w:t>Facultad de Ciencias Exactas y Naturales.</w:t>
+        <w:t xml:space="preserve">Representante del Decano. </w:t>
+      </w:r>
+      <w:r>
+        <w:rPr>
+          <w:rFonts w:ascii="Goudy Old Style" w:hAnsi="Goudy Old Style"/>
+          <w:b/>
+        </w:rPr>
+        <w:t xml:space="preserve"> </w:t>
       </w:r>
     </w:p>
     <w:p>
@@ -1333,6 +1490,24 @@
           <w:rFonts w:ascii="Goudy Old Style" w:hAnsi="Goudy Old Style"/>
           <w:b/>
         </w:rPr>
+        <w:t>Facultad de Ciencias Exactas y Naturales.</w:t>
+      </w:r>
+    </w:p>
+    <w:p>
+      <w:pPr>
+        <w:spacing w:after="0" w:line="240" w:lineRule="auto"/>
+        <w:ind w:left="1568" w:right="1559"/>
+        <w:jc w:val="center"/>
+        <w:rPr>
+          <w:rFonts w:ascii="Goudy Old Style" w:hAnsi="Goudy Old Style"/>
+          <w:b/>
+        </w:rPr>
+      </w:pPr>
+      <w:r>
+        <w:rPr>
+          <w:rFonts w:ascii="Goudy Old Style" w:hAnsi="Goudy Old Style"/>
+          <w:b/>
+        </w:rPr>
         <w:t xml:space="preserve"> </w:t>
       </w:r>
       <w:r>
@@ -1340,49 +1515,52 @@
           <w:rFonts w:ascii="Goudy Old Style" w:hAnsi="Goudy Old Style"/>
           <w:b/>
         </w:rPr>
-        <w:t xml:space="preserve">-quien preside-   </w:t>
-      </w:r>
-    </w:p>
-    <w:p>
-      <w:pPr>
-        <w:pStyle w:val="Heading1"/>
-        <w:ind w:left="-5"/>
-        <w:rPr>
-          <w:rFonts w:ascii="Goudy Old Style" w:hAnsi="Goudy Old Style"/>
-          <w:b w:val="0"/>
-          <w:bCs/>
-        </w:rPr>
-      </w:pPr>
-    </w:p>
-    <w:p>
-      <w:pPr>
-        <w:rPr>
-          <w:bCs/>
-        </w:rPr>
-      </w:pPr>
-    </w:p>
-    <w:p>
-      <w:pPr>
-        <w:rPr>
-          <w:bCs/>
-        </w:rPr>
-      </w:pPr>
-    </w:p>
-    <w:p>
-      <w:pPr>
-        <w:pStyle w:val="Heading1"/>
-        <w:ind w:left="-5"/>
-        <w:rPr>
-          <w:rFonts w:ascii="Goudy Old Style" w:hAnsi="Goudy Old Style"/>
-          <w:b w:val="0"/>
-          <w:bCs/>
-        </w:rPr>
-      </w:pPr>
+        <w:t>-quien preside-</w:t>
+      </w:r>
     </w:p>
     <w:p>
       <w:pPr>
         <w:spacing w:after="0" w:line="240" w:lineRule="auto"/>
-        <w:ind w:firstLine="698"/>
+        <w:ind w:left="1568" w:right="1559"/>
+        <w:jc w:val="center"/>
+        <w:rPr>
+          <w:rFonts w:ascii="Goudy Old Style" w:hAnsi="Goudy Old Style"/>
+          <w:b/>
+        </w:rPr>
+      </w:pPr>
+    </w:p>
+    <w:p>
+      <w:pPr>
+        <w:spacing w:after="0" w:line="240" w:lineRule="auto"/>
+        <w:ind w:left="1568" w:right="1559"/>
+        <w:jc w:val="center"/>
+        <w:rPr>
+          <w:rFonts w:ascii="Goudy Old Style" w:hAnsi="Goudy Old Style"/>
+          <w:b/>
+        </w:rPr>
+      </w:pPr>
+    </w:p>
+    <w:p>
+      <w:pPr>
+        <w:spacing w:after="0" w:line="240" w:lineRule="auto"/>
+        <w:ind w:left="1568" w:right="1559"/>
+        <w:jc w:val="center"/>
+        <w:rPr>
+          <w:rFonts w:ascii="Goudy Old Style" w:hAnsi="Goudy Old Style"/>
+          <w:b/>
+        </w:rPr>
+      </w:pPr>
+      <w:r>
+        <w:rPr>
+          <w:rFonts w:ascii="Goudy Old Style" w:hAnsi="Goudy Old Style"/>
+          <w:b/>
+        </w:rPr>
+        <w:t xml:space="preserve">   </w:t>
+      </w:r>
+    </w:p>
+    <w:p>
+      <w:pPr>
+        <w:spacing w:after="0" w:line="240" w:lineRule="auto"/>
         <w:rPr>
           <w:rFonts w:ascii="Goudy Old Style" w:hAnsi="Goudy Old Style"/>
           <w:b/>
@@ -1460,12 +1638,6 @@
       </w:r>
       <w:r>
         <w:rPr>
-          <w:rFonts w:ascii="Goudy Old Style" w:hAnsi="Goudy Old Style"/>
-        </w:rPr>
-        <w:tab/>
-      </w:r>
-      <w:r>
-        <w:rPr>
           <w:rFonts w:ascii="Goudy Old Style" w:eastAsia="Times New Roman" w:hAnsi="Goudy Old Style" w:cs="Times New Roman"/>
           <w:color w:val="auto"/>
           <w:kern w:val="0"/>
@@ -1500,7 +1672,6 @@
     <w:p>
       <w:pPr>
         <w:pStyle w:val="Heading1"/>
-        <w:ind w:left="708" w:firstLine="0"/>
         <w:rPr>
           <w:rFonts w:ascii="Goudy Old Style" w:hAnsi="Goudy Old Style"/>
         </w:rPr>
@@ -1556,14 +1727,7 @@
         <w:rPr>
           <w:rFonts w:ascii="Goudy Old Style" w:hAnsi="Goudy Old Style"/>
         </w:rPr>
-        <w:tab/>
-      </w:r>
-      <w:r>
-        <w:rPr>
-          <w:rFonts w:ascii="Goudy Old Style" w:hAnsi="Goudy Old Style"/>
-        </w:rPr>
-        <w:tab/>
-        <w:t xml:space="preserve">  </w:t>
+        <w:t xml:space="preserve">      </w:t>
       </w:r>
       <w:r>
         <w:rPr>
@@ -1607,23 +1771,159 @@
         <w:t>.</w:t>
       </w:r>
     </w:p>
-    <w:p>
-      <w:pPr>
-        <w:pStyle w:val="Heading1"/>
-        <w:ind w:left="0" w:firstLine="0"/>
-        <w:rPr>
-          <w:rFonts w:ascii="Goudy Old Style" w:hAnsi="Goudy Old Style"/>
-          <w:b w:val="0"/>
+    <w:p/>
+    <w:p/>
+    <w:p>
+      <w:pPr>
+        <w:tabs>
+          <w:tab w:val="center" w:pos="6706"/>
+        </w:tabs>
+        <w:spacing w:after="0" w:line="265" w:lineRule="auto"/>
+        <w:ind w:left="-15" w:right="0" w:firstLine="0"/>
+        <w:jc w:val="center"/>
+        <w:rPr>
+          <w:rFonts w:ascii="Goudy Old Style" w:hAnsi="Goudy Old Style"/>
+        </w:rPr>
+      </w:pPr>
+      <w:r>
+        <w:rPr>
+          <w:rFonts w:ascii="Goudy Old Style" w:hAnsi="Goudy Old Style"/>
+        </w:rPr>
+        <w:t>{{</w:t>
+      </w:r>
+      <w:proofErr w:type="spellStart"/>
+      <w:r>
+        <w:rPr>
+          <w:rFonts w:ascii="Goudy Old Style" w:hAnsi="Goudy Old Style"/>
+        </w:rPr>
+        <w:t>asesor_nombre</w:t>
+      </w:r>
+      <w:proofErr w:type="spellEnd"/>
+      <w:r>
+        <w:rPr>
+          <w:rFonts w:ascii="Goudy Old Style" w:hAnsi="Goudy Old Style"/>
+        </w:rPr>
+        <w:t>}</w:t>
+      </w:r>
+      <w:r>
+        <w:rPr>
+          <w:rFonts w:ascii="Goudy Old Style" w:hAnsi="Goudy Old Style"/>
+        </w:rPr>
+        <w:t>}</w:t>
+      </w:r>
+    </w:p>
+    <w:p>
+      <w:pPr>
+        <w:tabs>
+          <w:tab w:val="center" w:pos="6706"/>
+        </w:tabs>
+        <w:spacing w:after="0" w:line="265" w:lineRule="auto"/>
+        <w:ind w:left="-15" w:right="0" w:firstLine="0"/>
+        <w:jc w:val="center"/>
+        <w:rPr>
+          <w:rFonts w:ascii="Goudy Old Style" w:hAnsi="Goudy Old Style"/>
+          <w:b/>
           <w:bCs/>
         </w:rPr>
       </w:pPr>
       <w:r>
         <w:rPr>
           <w:rFonts w:ascii="Goudy Old Style" w:hAnsi="Goudy Old Style"/>
-          <w:b w:val="0"/>
+          <w:b/>
           <w:bCs/>
         </w:rPr>
-        <w:t xml:space="preserve">          </w:t>
+        <w:t>Asesor</w:t>
+      </w:r>
+      <w:r>
+        <w:rPr>
+          <w:rFonts w:ascii="Goudy Old Style" w:hAnsi="Goudy Old Style"/>
+          <w:b/>
+          <w:bCs/>
+        </w:rPr>
+        <w:t>.</w:t>
+      </w:r>
+    </w:p>
+    <w:p>
+      <w:pPr>
+        <w:tabs>
+          <w:tab w:val="center" w:pos="6706"/>
+        </w:tabs>
+        <w:spacing w:after="0" w:line="265" w:lineRule="auto"/>
+        <w:ind w:left="-15" w:right="0" w:firstLine="0"/>
+        <w:jc w:val="center"/>
+        <w:rPr>
+          <w:rFonts w:ascii="Goudy Old Style" w:hAnsi="Goudy Old Style"/>
+          <w:b/>
+          <w:bCs/>
+        </w:rPr>
+      </w:pPr>
+    </w:p>
+    <w:p>
+      <w:pPr>
+        <w:tabs>
+          <w:tab w:val="center" w:pos="6706"/>
+        </w:tabs>
+        <w:spacing w:after="0" w:line="265" w:lineRule="auto"/>
+        <w:ind w:left="-15" w:right="0" w:firstLine="0"/>
+        <w:jc w:val="center"/>
+        <w:rPr>
+          <w:rFonts w:ascii="Goudy Old Style" w:hAnsi="Goudy Old Style"/>
+          <w:b/>
+          <w:bCs/>
+        </w:rPr>
+      </w:pPr>
+    </w:p>
+    <w:p>
+      <w:pPr>
+        <w:tabs>
+          <w:tab w:val="center" w:pos="6706"/>
+        </w:tabs>
+        <w:spacing w:after="0" w:line="265" w:lineRule="auto"/>
+        <w:ind w:left="-15" w:right="0" w:firstLine="0"/>
+        <w:rPr>
+          <w:rFonts w:ascii="Goudy Old Style" w:hAnsi="Goudy Old Style"/>
+          <w:b/>
+          <w:bCs/>
+        </w:rPr>
+      </w:pPr>
+      <w:r>
+        <w:rPr>
+          <w:rFonts w:ascii="Goudy Old Style" w:hAnsi="Goudy Old Style"/>
+          <w:iCs/>
+        </w:rPr>
+        <w:t>{{postulante1_nombre</w:t>
+      </w:r>
+      <w:proofErr w:type="gramStart"/>
+      <w:r>
+        <w:rPr>
+          <w:rFonts w:ascii="Goudy Old Style" w:hAnsi="Goudy Old Style"/>
+          <w:iCs/>
+        </w:rPr>
+        <w:t xml:space="preserve">}}   </w:t>
+      </w:r>
+      <w:proofErr w:type="gramEnd"/>
+      <w:r>
+        <w:rPr>
+          <w:rFonts w:ascii="Goudy Old Style" w:hAnsi="Goudy Old Style"/>
+          <w:iCs/>
+        </w:rPr>
+        <w:t xml:space="preserve">                                                     </w:t>
+      </w:r>
+      <w:proofErr w:type="gramStart"/>
+      <w:r>
+        <w:rPr>
+          <w:rFonts w:ascii="Goudy Old Style" w:hAnsi="Goudy Old Style"/>
+          <w:iCs/>
+        </w:rPr>
+        <w:t xml:space="preserve">   {</w:t>
+      </w:r>
+      <w:proofErr w:type="gramEnd"/>
+      <w:r>
+        <w:rPr>
+          <w:rFonts w:ascii="Goudy Old Style" w:hAnsi="Goudy Old Style"/>
+          <w:iCs/>
+        </w:rPr>
+        <w:t>{postulante2_nombre}}</w:t>
       </w:r>
     </w:p>
     <w:p>
@@ -1636,9 +1936,102 @@
         <w:jc w:val="left"/>
         <w:rPr>
           <w:rFonts w:ascii="Goudy Old Style" w:hAnsi="Goudy Old Style"/>
-        </w:rPr>
-      </w:pPr>
-    </w:p>
+          <w:b/>
+          <w:bCs/>
+          <w:iCs/>
+        </w:rPr>
+      </w:pPr>
+      <w:r>
+        <w:rPr>
+          <w:rFonts w:ascii="Goudy Old Style" w:hAnsi="Goudy Old Style"/>
+          <w:b/>
+          <w:bCs/>
+          <w:iCs/>
+        </w:rPr>
+        <w:t xml:space="preserve">  </w:t>
+      </w:r>
+      <w:r>
+        <w:rPr>
+          <w:rFonts w:ascii="Goudy Old Style" w:hAnsi="Goudy Old Style"/>
+          <w:iCs/>
+        </w:rPr>
+        <w:t>{{postulante1_cedula</w:t>
+      </w:r>
+      <w:proofErr w:type="gramStart"/>
+      <w:r>
+        <w:rPr>
+          <w:rFonts w:ascii="Goudy Old Style" w:hAnsi="Goudy Old Style"/>
+          <w:iCs/>
+        </w:rPr>
+        <w:t>}}</w:t>
+      </w:r>
+      <w:r>
+        <w:rPr>
+          <w:rFonts w:ascii="Goudy Old Style" w:hAnsi="Goudy Old Style"/>
+          <w:b/>
+          <w:bCs/>
+          <w:iCs/>
+        </w:rPr>
+        <w:t xml:space="preserve">  </w:t>
+      </w:r>
+      <w:r>
+        <w:rPr>
+          <w:rFonts w:ascii="Goudy Old Style" w:hAnsi="Goudy Old Style"/>
+          <w:b/>
+          <w:bCs/>
+          <w:iCs/>
+        </w:rPr>
+        <w:t xml:space="preserve"> </w:t>
+      </w:r>
+      <w:proofErr w:type="gramEnd"/>
+      <w:r>
+        <w:rPr>
+          <w:rFonts w:ascii="Goudy Old Style" w:hAnsi="Goudy Old Style"/>
+          <w:b/>
+          <w:bCs/>
+          <w:iCs/>
+        </w:rPr>
+        <w:t xml:space="preserve">                                             </w:t>
+      </w:r>
+      <w:r>
+        <w:rPr>
+          <w:rFonts w:ascii="Goudy Old Style" w:hAnsi="Goudy Old Style"/>
+          <w:b/>
+          <w:bCs/>
+          <w:iCs/>
+        </w:rPr>
+        <w:t xml:space="preserve">          </w:t>
+      </w:r>
+      <w:proofErr w:type="gramStart"/>
+      <w:r>
+        <w:rPr>
+          <w:rFonts w:ascii="Goudy Old Style" w:hAnsi="Goudy Old Style"/>
+          <w:b/>
+          <w:bCs/>
+          <w:iCs/>
+        </w:rPr>
+        <w:t xml:space="preserve">   </w:t>
+      </w:r>
+      <w:r>
+        <w:rPr>
+          <w:rFonts w:ascii="Goudy Old Style" w:hAnsi="Goudy Old Style"/>
+          <w:iCs/>
+        </w:rPr>
+        <w:t>{</w:t>
+      </w:r>
+      <w:proofErr w:type="gramEnd"/>
+      <w:r>
+        <w:rPr>
+          <w:rFonts w:ascii="Goudy Old Style" w:hAnsi="Goudy Old Style"/>
+          <w:iCs/>
+        </w:rPr>
+        <w:t>{postulante2_cedula}}</w:t>
+      </w:r>
+    </w:p>
+    <w:p/>
+    <w:p/>
+    <w:p/>
+    <w:p/>
     <w:p>
       <w:pPr>
         <w:tabs>
@@ -1651,48 +2044,17 @@
           <w:rFonts w:ascii="Goudy Old Style" w:hAnsi="Goudy Old Style"/>
         </w:rPr>
       </w:pPr>
-    </w:p>
-    <w:p>
-      <w:pPr>
-        <w:tabs>
-          <w:tab w:val="center" w:pos="6706"/>
-        </w:tabs>
-        <w:spacing w:after="0" w:line="265" w:lineRule="auto"/>
-        <w:ind w:left="-15" w:right="0" w:firstLine="0"/>
-        <w:jc w:val="center"/>
-        <w:rPr>
-          <w:rFonts w:ascii="Goudy Old Style" w:hAnsi="Goudy Old Style"/>
-        </w:rPr>
-      </w:pPr>
-    </w:p>
-    <w:p>
-      <w:pPr>
-        <w:tabs>
-          <w:tab w:val="center" w:pos="6706"/>
-        </w:tabs>
-        <w:spacing w:after="0" w:line="265" w:lineRule="auto"/>
-        <w:ind w:left="-15" w:right="0" w:firstLine="0"/>
-        <w:jc w:val="center"/>
-        <w:rPr>
-          <w:rFonts w:ascii="Goudy Old Style" w:hAnsi="Goudy Old Style"/>
-        </w:rPr>
-      </w:pPr>
-    </w:p>
-    <w:p>
-      <w:pPr>
-        <w:tabs>
-          <w:tab w:val="center" w:pos="6706"/>
-        </w:tabs>
-        <w:spacing w:after="0" w:line="265" w:lineRule="auto"/>
-        <w:ind w:left="-15" w:right="0" w:firstLine="0"/>
-        <w:jc w:val="center"/>
-        <w:rPr>
-          <w:rFonts w:ascii="Goudy Old Style" w:hAnsi="Goudy Old Style"/>
-        </w:rPr>
-      </w:pPr>
-      <w:r>
-        <w:rPr>
-          <w:rFonts w:ascii="Goudy Old Style" w:hAnsi="Goudy Old Style"/>
+      <w:r>
+        <w:rPr>
+          <w:rFonts w:ascii="Goudy Old Style" w:hAnsi="Goudy Old Style"/>
+          <w:bCs/>
+        </w:rPr>
+        <w:t xml:space="preserve">OBSERVACIONES: </w:t>
+      </w:r>
+      <w:r>
+        <w:rPr>
+          <w:rFonts w:ascii="Goudy Old Style" w:hAnsi="Goudy Old Style"/>
+          <w:iCs/>
         </w:rPr>
         <w:t>{{</w:t>
       </w:r>
@@ -1700,364 +2062,17 @@
       <w:r>
         <w:rPr>
           <w:rFonts w:ascii="Goudy Old Style" w:hAnsi="Goudy Old Style"/>
-        </w:rPr>
-        <w:t>asesor_nombre</w:t>
+          <w:iCs/>
+        </w:rPr>
+        <w:t>observaciones_detalle</w:t>
       </w:r>
       <w:proofErr w:type="spellEnd"/>
       <w:r>
         <w:rPr>
           <w:rFonts w:ascii="Goudy Old Style" w:hAnsi="Goudy Old Style"/>
-        </w:rPr>
-        <w:t>}</w:t>
-      </w:r>
-      <w:r>
-        <w:rPr>
-          <w:rFonts w:ascii="Goudy Old Style" w:hAnsi="Goudy Old Style"/>
-        </w:rPr>
-        <w:t>}</w:t>
-      </w:r>
-    </w:p>
-    <w:p>
-      <w:pPr>
-        <w:tabs>
-          <w:tab w:val="center" w:pos="6706"/>
-        </w:tabs>
-        <w:spacing w:after="0" w:line="265" w:lineRule="auto"/>
-        <w:ind w:left="-15" w:right="0" w:firstLine="0"/>
-        <w:jc w:val="center"/>
-        <w:rPr>
-          <w:rFonts w:ascii="Goudy Old Style" w:hAnsi="Goudy Old Style"/>
-          <w:b/>
-          <w:bCs/>
-        </w:rPr>
-      </w:pPr>
-      <w:r>
-        <w:rPr>
-          <w:rFonts w:ascii="Goudy Old Style" w:hAnsi="Goudy Old Style"/>
-          <w:b/>
-          <w:bCs/>
-        </w:rPr>
-        <w:t>Asesor</w:t>
-      </w:r>
-      <w:r>
-        <w:rPr>
-          <w:rFonts w:ascii="Goudy Old Style" w:hAnsi="Goudy Old Style"/>
-          <w:b/>
-          <w:bCs/>
-        </w:rPr>
-        <w:t>.</w:t>
-      </w:r>
-    </w:p>
-    <w:p>
-      <w:pPr>
-        <w:tabs>
-          <w:tab w:val="center" w:pos="6706"/>
-        </w:tabs>
-        <w:spacing w:after="0" w:line="265" w:lineRule="auto"/>
-        <w:ind w:left="-15" w:right="0" w:firstLine="0"/>
-        <w:jc w:val="left"/>
-        <w:rPr>
-          <w:rFonts w:ascii="Goudy Old Style" w:hAnsi="Goudy Old Style"/>
-          <w:b/>
-          <w:bCs/>
-        </w:rPr>
-      </w:pPr>
-    </w:p>
-    <w:p>
-      <w:pPr>
-        <w:tabs>
-          <w:tab w:val="center" w:pos="6706"/>
-        </w:tabs>
-        <w:spacing w:after="0" w:line="265" w:lineRule="auto"/>
-        <w:ind w:left="-15" w:right="0" w:firstLine="0"/>
-        <w:jc w:val="left"/>
-        <w:rPr>
-          <w:rFonts w:ascii="Goudy Old Style" w:hAnsi="Goudy Old Style"/>
-          <w:b/>
-          <w:bCs/>
-        </w:rPr>
-      </w:pPr>
-    </w:p>
-    <w:p>
-      <w:pPr>
-        <w:tabs>
-          <w:tab w:val="center" w:pos="6706"/>
-        </w:tabs>
-        <w:spacing w:after="0" w:line="265" w:lineRule="auto"/>
-        <w:ind w:left="-15" w:right="0" w:firstLine="0"/>
-        <w:jc w:val="left"/>
-        <w:rPr>
-          <w:rFonts w:ascii="Goudy Old Style" w:hAnsi="Goudy Old Style"/>
-          <w:b/>
-          <w:bCs/>
-        </w:rPr>
-      </w:pPr>
-    </w:p>
-    <w:p>
-      <w:pPr>
-        <w:tabs>
-          <w:tab w:val="center" w:pos="6706"/>
-        </w:tabs>
-        <w:spacing w:after="0" w:line="265" w:lineRule="auto"/>
-        <w:ind w:left="-15" w:right="0" w:firstLine="0"/>
-        <w:jc w:val="left"/>
-        <w:rPr>
-          <w:rFonts w:ascii="Goudy Old Style" w:hAnsi="Goudy Old Style"/>
-          <w:b/>
-          <w:bCs/>
-        </w:rPr>
-      </w:pPr>
-    </w:p>
-    <w:p>
-      <w:pPr>
-        <w:tabs>
-          <w:tab w:val="center" w:pos="6706"/>
-        </w:tabs>
-        <w:spacing w:after="0" w:line="265" w:lineRule="auto"/>
-        <w:ind w:left="-15" w:right="0" w:firstLine="0"/>
-        <w:jc w:val="left"/>
-        <w:rPr>
-          <w:rFonts w:ascii="Goudy Old Style" w:hAnsi="Goudy Old Style"/>
           <w:iCs/>
         </w:rPr>
-      </w:pPr>
-      <w:r>
-        <w:rPr>
-          <w:rFonts w:ascii="Goudy Old Style" w:hAnsi="Goudy Old Style"/>
-          <w:iCs/>
-        </w:rPr>
-        <w:t>{{postulante1_nombre</w:t>
-      </w:r>
-      <w:proofErr w:type="gramStart"/>
-      <w:r>
-        <w:rPr>
-          <w:rFonts w:ascii="Goudy Old Style" w:hAnsi="Goudy Old Style"/>
-          <w:iCs/>
-        </w:rPr>
-        <w:t xml:space="preserve">}}   </w:t>
-      </w:r>
-      <w:proofErr w:type="gramEnd"/>
-      <w:r>
-        <w:rPr>
-          <w:rFonts w:ascii="Goudy Old Style" w:hAnsi="Goudy Old Style"/>
-          <w:iCs/>
-        </w:rPr>
-        <w:t xml:space="preserve">                                                     </w:t>
-      </w:r>
-      <w:proofErr w:type="gramStart"/>
-      <w:r>
-        <w:rPr>
-          <w:rFonts w:ascii="Goudy Old Style" w:hAnsi="Goudy Old Style"/>
-          <w:iCs/>
-        </w:rPr>
-        <w:t xml:space="preserve">   {</w:t>
-      </w:r>
-      <w:proofErr w:type="gramEnd"/>
-      <w:r>
-        <w:rPr>
-          <w:rFonts w:ascii="Goudy Old Style" w:hAnsi="Goudy Old Style"/>
-          <w:iCs/>
-        </w:rPr>
-        <w:t>{postulante2_nombre}}</w:t>
-      </w:r>
-    </w:p>
-    <w:p>
-      <w:pPr>
-        <w:tabs>
-          <w:tab w:val="center" w:pos="6706"/>
-        </w:tabs>
-        <w:spacing w:after="0" w:line="265" w:lineRule="auto"/>
-        <w:ind w:left="-15" w:right="0" w:firstLine="0"/>
-        <w:jc w:val="left"/>
-        <w:rPr>
-          <w:rFonts w:ascii="Goudy Old Style" w:hAnsi="Goudy Old Style"/>
-          <w:b/>
-          <w:bCs/>
-          <w:iCs/>
-        </w:rPr>
-      </w:pPr>
-      <w:r>
-        <w:rPr>
-          <w:rFonts w:ascii="Goudy Old Style" w:hAnsi="Goudy Old Style"/>
-          <w:b/>
-          <w:bCs/>
-          <w:iCs/>
-        </w:rPr>
-        <w:t xml:space="preserve">  </w:t>
-      </w:r>
-      <w:r>
-        <w:rPr>
-          <w:rFonts w:ascii="Goudy Old Style" w:hAnsi="Goudy Old Style"/>
-          <w:iCs/>
-        </w:rPr>
-        <w:t>{{postulante1_cedula</w:t>
-      </w:r>
-      <w:proofErr w:type="gramStart"/>
-      <w:r>
-        <w:rPr>
-          <w:rFonts w:ascii="Goudy Old Style" w:hAnsi="Goudy Old Style"/>
-          <w:iCs/>
-        </w:rPr>
         <w:t>}}</w:t>
-      </w:r>
-      <w:r>
-        <w:rPr>
-          <w:rFonts w:ascii="Goudy Old Style" w:hAnsi="Goudy Old Style"/>
-          <w:b/>
-          <w:bCs/>
-          <w:iCs/>
-        </w:rPr>
-        <w:t xml:space="preserve">  </w:t>
-      </w:r>
-      <w:r>
-        <w:rPr>
-          <w:rFonts w:ascii="Goudy Old Style" w:hAnsi="Goudy Old Style"/>
-          <w:b/>
-          <w:bCs/>
-          <w:iCs/>
-        </w:rPr>
-        <w:t xml:space="preserve"> </w:t>
-      </w:r>
-      <w:proofErr w:type="gramEnd"/>
-      <w:r>
-        <w:rPr>
-          <w:rFonts w:ascii="Goudy Old Style" w:hAnsi="Goudy Old Style"/>
-          <w:b/>
-          <w:bCs/>
-          <w:iCs/>
-        </w:rPr>
-        <w:t xml:space="preserve">                                             </w:t>
-      </w:r>
-      <w:r>
-        <w:rPr>
-          <w:rFonts w:ascii="Goudy Old Style" w:hAnsi="Goudy Old Style"/>
-          <w:b/>
-          <w:bCs/>
-          <w:iCs/>
-        </w:rPr>
-        <w:t xml:space="preserve">          </w:t>
-      </w:r>
-      <w:proofErr w:type="gramStart"/>
-      <w:r>
-        <w:rPr>
-          <w:rFonts w:ascii="Goudy Old Style" w:hAnsi="Goudy Old Style"/>
-          <w:b/>
-          <w:bCs/>
-          <w:iCs/>
-        </w:rPr>
-        <w:t xml:space="preserve">   </w:t>
-      </w:r>
-      <w:r>
-        <w:rPr>
-          <w:rFonts w:ascii="Goudy Old Style" w:hAnsi="Goudy Old Style"/>
-          <w:iCs/>
-        </w:rPr>
-        <w:t>{</w:t>
-      </w:r>
-      <w:proofErr w:type="gramEnd"/>
-      <w:r>
-        <w:rPr>
-          <w:rFonts w:ascii="Goudy Old Style" w:hAnsi="Goudy Old Style"/>
-          <w:iCs/>
-        </w:rPr>
-        <w:t>{postulante2_cedula}}</w:t>
-      </w:r>
-    </w:p>
-    <w:p>
-      <w:pPr>
-        <w:tabs>
-          <w:tab w:val="center" w:pos="6706"/>
-        </w:tabs>
-        <w:spacing w:after="0" w:line="265" w:lineRule="auto"/>
-        <w:ind w:left="-15" w:right="0" w:firstLine="0"/>
-        <w:jc w:val="left"/>
-        <w:rPr>
-          <w:rFonts w:ascii="Goudy Old Style" w:hAnsi="Goudy Old Style"/>
-          <w:bCs/>
-        </w:rPr>
-      </w:pPr>
-    </w:p>
-    <w:p>
-      <w:pPr>
-        <w:tabs>
-          <w:tab w:val="center" w:pos="6706"/>
-        </w:tabs>
-        <w:spacing w:after="0" w:line="265" w:lineRule="auto"/>
-        <w:ind w:left="-15" w:right="0" w:firstLine="0"/>
-        <w:jc w:val="left"/>
-        <w:rPr>
-          <w:rFonts w:ascii="Goudy Old Style" w:hAnsi="Goudy Old Style"/>
-          <w:bCs/>
-        </w:rPr>
-      </w:pPr>
-    </w:p>
-    <w:p>
-      <w:pPr>
-        <w:tabs>
-          <w:tab w:val="center" w:pos="6706"/>
-        </w:tabs>
-        <w:spacing w:after="0" w:line="265" w:lineRule="auto"/>
-        <w:ind w:left="-15" w:right="0" w:firstLine="0"/>
-        <w:jc w:val="left"/>
-        <w:rPr>
-          <w:rFonts w:ascii="Goudy Old Style" w:hAnsi="Goudy Old Style"/>
-          <w:bCs/>
-        </w:rPr>
-      </w:pPr>
-    </w:p>
-    <w:p>
-      <w:pPr>
-        <w:tabs>
-          <w:tab w:val="center" w:pos="6706"/>
-        </w:tabs>
-        <w:spacing w:after="0" w:line="265" w:lineRule="auto"/>
-        <w:ind w:left="-15" w:right="0" w:firstLine="0"/>
-        <w:jc w:val="left"/>
-        <w:rPr>
-          <w:rFonts w:ascii="Goudy Old Style" w:hAnsi="Goudy Old Style"/>
-          <w:bCs/>
-        </w:rPr>
-      </w:pPr>
-    </w:p>
-    <w:p>
-      <w:pPr>
-        <w:tabs>
-          <w:tab w:val="center" w:pos="6706"/>
-        </w:tabs>
-        <w:spacing w:after="0" w:line="265" w:lineRule="auto"/>
-        <w:ind w:left="-15" w:right="0" w:firstLine="0"/>
-        <w:jc w:val="left"/>
-        <w:rPr>
-          <w:rFonts w:ascii="Goudy Old Style" w:hAnsi="Goudy Old Style"/>
-          <w:bCs/>
-        </w:rPr>
-      </w:pPr>
-    </w:p>
-    <w:p>
-      <w:pPr>
-        <w:tabs>
-          <w:tab w:val="center" w:pos="6706"/>
-        </w:tabs>
-        <w:spacing w:after="0" w:line="265" w:lineRule="auto"/>
-        <w:ind w:left="-15" w:right="0" w:firstLine="0"/>
-        <w:jc w:val="left"/>
-        <w:rPr>
-          <w:rFonts w:ascii="Goudy Old Style" w:hAnsi="Goudy Old Style"/>
-        </w:rPr>
-      </w:pPr>
-      <w:r>
-        <w:rPr>
-          <w:rFonts w:ascii="Goudy Old Style" w:hAnsi="Goudy Old Style"/>
-          <w:bCs/>
-        </w:rPr>
-        <w:t xml:space="preserve">OBSERVACIONES: </w:t>
-      </w:r>
-      <w:r>
-        <w:rPr>
-          <w:rFonts w:ascii="Goudy Old Style" w:hAnsi="Goudy Old Style"/>
-          <w:iCs/>
-        </w:rPr>
-        <w:t>{{observaciones_detalle}}</w:t>
       </w:r>
     </w:p>
     <w:p>
@@ -2400,6 +2415,285 @@
           </v:group>
         </w:pict>
       </w:r>
+    </w:p>
+    <w:p/>
+    <w:p/>
+    <w:p>
+      <w:pPr>
+        <w:spacing w:after="95" w:line="259" w:lineRule="auto"/>
+        <w:ind w:left="4094" w:right="0" w:firstLine="0"/>
+        <w:jc w:val="left"/>
+        <w:rPr>
+          <w:rFonts w:ascii="Goudy Old Style" w:hAnsi="Goudy Old Style"/>
+        </w:rPr>
+      </w:pPr>
+    </w:p>
+    <w:p>
+      <w:pPr>
+        <w:spacing w:after="95" w:line="259" w:lineRule="auto"/>
+        <w:ind w:left="4094" w:right="0" w:firstLine="0"/>
+        <w:jc w:val="left"/>
+        <w:rPr>
+          <w:rFonts w:ascii="Goudy Old Style" w:hAnsi="Goudy Old Style"/>
+        </w:rPr>
+      </w:pPr>
+    </w:p>
+    <w:p>
+      <w:pPr>
+        <w:spacing w:after="95" w:line="259" w:lineRule="auto"/>
+        <w:ind w:left="4094" w:right="0" w:firstLine="0"/>
+        <w:jc w:val="left"/>
+        <w:rPr>
+          <w:rFonts w:ascii="Goudy Old Style" w:hAnsi="Goudy Old Style"/>
+        </w:rPr>
+      </w:pPr>
+    </w:p>
+    <w:p>
+      <w:pPr>
+        <w:spacing w:after="0" w:line="259" w:lineRule="auto"/>
+        <w:ind w:left="0" w:right="5" w:firstLine="0"/>
+        <w:jc w:val="center"/>
+        <w:rPr>
+          <w:rFonts w:ascii="Goudy Old Style" w:hAnsi="Goudy Old Style"/>
+        </w:rPr>
+      </w:pPr>
+    </w:p>
+    <w:p>
+      <w:pPr>
+        <w:pStyle w:val="Heading1"/>
+        <w:ind w:left="-5"/>
+        <w:rPr>
+          <w:rFonts w:ascii="Goudy Old Style" w:hAnsi="Goudy Old Style"/>
+          <w:b w:val="0"/>
+          <w:bCs/>
+        </w:rPr>
+      </w:pPr>
+    </w:p>
+    <w:p>
+      <w:pPr>
+        <w:rPr>
+          <w:bCs/>
+        </w:rPr>
+      </w:pPr>
+    </w:p>
+    <w:p>
+      <w:pPr>
+        <w:rPr>
+          <w:bCs/>
+        </w:rPr>
+      </w:pPr>
+    </w:p>
+    <w:p>
+      <w:pPr>
+        <w:pStyle w:val="Heading1"/>
+        <w:ind w:left="-5"/>
+        <w:rPr>
+          <w:rFonts w:ascii="Goudy Old Style" w:hAnsi="Goudy Old Style"/>
+          <w:b w:val="0"/>
+          <w:bCs/>
+        </w:rPr>
+      </w:pPr>
+    </w:p>
+    <w:p>
+      <w:pPr>
+        <w:pStyle w:val="Heading1"/>
+        <w:ind w:left="0" w:firstLine="0"/>
+        <w:rPr>
+          <w:rFonts w:ascii="Goudy Old Style" w:hAnsi="Goudy Old Style"/>
+          <w:b w:val="0"/>
+          <w:bCs/>
+        </w:rPr>
+      </w:pPr>
+      <w:r>
+        <w:rPr>
+          <w:rFonts w:ascii="Goudy Old Style" w:hAnsi="Goudy Old Style"/>
+          <w:b w:val="0"/>
+          <w:bCs/>
+        </w:rPr>
+        <w:t xml:space="preserve">          </w:t>
+      </w:r>
+    </w:p>
+    <w:p>
+      <w:pPr>
+        <w:tabs>
+          <w:tab w:val="center" w:pos="6706"/>
+        </w:tabs>
+        <w:spacing w:after="0" w:line="265" w:lineRule="auto"/>
+        <w:ind w:left="-15" w:right="0" w:firstLine="0"/>
+        <w:jc w:val="left"/>
+        <w:rPr>
+          <w:rFonts w:ascii="Goudy Old Style" w:hAnsi="Goudy Old Style"/>
+        </w:rPr>
+      </w:pPr>
+    </w:p>
+    <w:p>
+      <w:pPr>
+        <w:tabs>
+          <w:tab w:val="center" w:pos="6706"/>
+        </w:tabs>
+        <w:spacing w:after="0" w:line="265" w:lineRule="auto"/>
+        <w:ind w:left="-15" w:right="0" w:firstLine="0"/>
+        <w:jc w:val="left"/>
+        <w:rPr>
+          <w:rFonts w:ascii="Goudy Old Style" w:hAnsi="Goudy Old Style"/>
+        </w:rPr>
+      </w:pPr>
+    </w:p>
+    <w:p>
+      <w:pPr>
+        <w:tabs>
+          <w:tab w:val="center" w:pos="6706"/>
+        </w:tabs>
+        <w:spacing w:after="0" w:line="265" w:lineRule="auto"/>
+        <w:ind w:left="-15" w:right="0" w:firstLine="0"/>
+        <w:jc w:val="center"/>
+        <w:rPr>
+          <w:rFonts w:ascii="Goudy Old Style" w:hAnsi="Goudy Old Style"/>
+        </w:rPr>
+      </w:pPr>
+    </w:p>
+    <w:p>
+      <w:pPr>
+        <w:tabs>
+          <w:tab w:val="center" w:pos="6706"/>
+        </w:tabs>
+        <w:spacing w:after="0" w:line="265" w:lineRule="auto"/>
+        <w:ind w:left="-15" w:right="0" w:firstLine="0"/>
+        <w:jc w:val="center"/>
+        <w:rPr>
+          <w:rFonts w:ascii="Goudy Old Style" w:hAnsi="Goudy Old Style"/>
+        </w:rPr>
+      </w:pPr>
+    </w:p>
+    <w:p>
+      <w:pPr>
+        <w:tabs>
+          <w:tab w:val="center" w:pos="6706"/>
+        </w:tabs>
+        <w:spacing w:after="0" w:line="265" w:lineRule="auto"/>
+        <w:ind w:left="-15" w:right="0" w:firstLine="0"/>
+        <w:jc w:val="left"/>
+        <w:rPr>
+          <w:rFonts w:ascii="Goudy Old Style" w:hAnsi="Goudy Old Style"/>
+          <w:b/>
+          <w:bCs/>
+        </w:rPr>
+      </w:pPr>
+    </w:p>
+    <w:p>
+      <w:pPr>
+        <w:tabs>
+          <w:tab w:val="center" w:pos="6706"/>
+        </w:tabs>
+        <w:spacing w:after="0" w:line="265" w:lineRule="auto"/>
+        <w:ind w:left="-15" w:right="0" w:firstLine="0"/>
+        <w:jc w:val="left"/>
+        <w:rPr>
+          <w:rFonts w:ascii="Goudy Old Style" w:hAnsi="Goudy Old Style"/>
+          <w:b/>
+          <w:bCs/>
+        </w:rPr>
+      </w:pPr>
+    </w:p>
+    <w:p>
+      <w:pPr>
+        <w:tabs>
+          <w:tab w:val="center" w:pos="6706"/>
+        </w:tabs>
+        <w:spacing w:after="0" w:line="265" w:lineRule="auto"/>
+        <w:ind w:left="-15" w:right="0" w:firstLine="0"/>
+        <w:jc w:val="left"/>
+        <w:rPr>
+          <w:rFonts w:ascii="Goudy Old Style" w:hAnsi="Goudy Old Style"/>
+          <w:b/>
+          <w:bCs/>
+        </w:rPr>
+      </w:pPr>
+    </w:p>
+    <w:p>
+      <w:pPr>
+        <w:tabs>
+          <w:tab w:val="center" w:pos="6706"/>
+        </w:tabs>
+        <w:spacing w:after="0" w:line="265" w:lineRule="auto"/>
+        <w:ind w:left="-15" w:right="0" w:firstLine="0"/>
+        <w:jc w:val="left"/>
+        <w:rPr>
+          <w:rFonts w:ascii="Goudy Old Style" w:hAnsi="Goudy Old Style"/>
+          <w:b/>
+          <w:bCs/>
+        </w:rPr>
+      </w:pPr>
+    </w:p>
+    <w:p>
+      <w:pPr>
+        <w:tabs>
+          <w:tab w:val="center" w:pos="6706"/>
+        </w:tabs>
+        <w:spacing w:after="0" w:line="265" w:lineRule="auto"/>
+        <w:ind w:left="-15" w:right="0" w:firstLine="0"/>
+        <w:jc w:val="left"/>
+        <w:rPr>
+          <w:rFonts w:ascii="Goudy Old Style" w:hAnsi="Goudy Old Style"/>
+          <w:bCs/>
+        </w:rPr>
+      </w:pPr>
+    </w:p>
+    <w:p>
+      <w:pPr>
+        <w:tabs>
+          <w:tab w:val="center" w:pos="6706"/>
+        </w:tabs>
+        <w:spacing w:after="0" w:line="265" w:lineRule="auto"/>
+        <w:ind w:left="-15" w:right="0" w:firstLine="0"/>
+        <w:jc w:val="left"/>
+        <w:rPr>
+          <w:rFonts w:ascii="Goudy Old Style" w:hAnsi="Goudy Old Style"/>
+          <w:bCs/>
+        </w:rPr>
+      </w:pPr>
+    </w:p>
+    <w:p>
+      <w:pPr>
+        <w:tabs>
+          <w:tab w:val="center" w:pos="6706"/>
+        </w:tabs>
+        <w:spacing w:after="0" w:line="265" w:lineRule="auto"/>
+        <w:ind w:left="-15" w:right="0" w:firstLine="0"/>
+        <w:jc w:val="left"/>
+        <w:rPr>
+          <w:rFonts w:ascii="Goudy Old Style" w:hAnsi="Goudy Old Style"/>
+          <w:bCs/>
+        </w:rPr>
+      </w:pPr>
+    </w:p>
+    <w:p>
+      <w:pPr>
+        <w:tabs>
+          <w:tab w:val="center" w:pos="6706"/>
+        </w:tabs>
+        <w:spacing w:after="0" w:line="265" w:lineRule="auto"/>
+        <w:ind w:left="-15" w:right="0" w:firstLine="0"/>
+        <w:jc w:val="left"/>
+        <w:rPr>
+          <w:rFonts w:ascii="Goudy Old Style" w:hAnsi="Goudy Old Style"/>
+          <w:bCs/>
+        </w:rPr>
+      </w:pPr>
+    </w:p>
+    <w:p>
+      <w:pPr>
+        <w:tabs>
+          <w:tab w:val="center" w:pos="6706"/>
+        </w:tabs>
+        <w:spacing w:after="0" w:line="265" w:lineRule="auto"/>
+        <w:ind w:left="-15" w:right="0" w:firstLine="0"/>
+        <w:jc w:val="left"/>
+        <w:rPr>
+          <w:rFonts w:ascii="Goudy Old Style" w:hAnsi="Goudy Old Style"/>
+          <w:bCs/>
+        </w:rPr>
+      </w:pPr>
     </w:p>
     <w:sectPr>
       <w:headerReference w:type="even" r:id="rId7"/>

</xml_diff>